<commit_message>
docs: sync Cosimo 18-point report with origin releases.
Update version refs to sbu_estimate 19.0.1.0.112 and sbu_purchase_flow 19.0.1.0.101; document ANACO cost rollup UI on punto 12.

Co-authored-by: Cursor <cursoragent@cursor.com>
</commit_message>
<xml_diff>
--- a/docs/REPORT_FEEDBACK_COSIMO_18_PUNTI_IT.docx
+++ b/docs/REPORT_FEEDBACK_COSIMO_18_PUNTI_IT.docx
@@ -27,7 +27,7 @@
     </w:p>
     <w:p xmlns:w="http://schemas.openxmlformats.org/wordprocessingml/2006/main">
       <w:r>
-        <w:t xml:space="preserve">Data: maggio 2026 (aggiornamento TMS Excel — sbu_purchase_flow 19.0.1.0.99)</w:t>
+        <w:t xml:space="preserve">Data: maggio 2026 (agg. sbu_purchase_flow 19.0.1.0.101, sbu_estimate 19.0.1.0.112)</w:t>
       </w:r>
     </w:p>
     <w:p xmlns:w="http://schemas.openxmlformats.org/wordprocessingml/2006/main">
@@ -470,7 +470,7 @@
         <w:tc>
           <w:p xmlns:w="http://schemas.openxmlformats.org/wordprocessingml/2006/main">
             <w:r>
-              <w:t>⚠️</w:t>
+              <w:t>⚠️ (schema costi ANACO in UI — UAT numerico)</w:t>
             </w:r>
           </w:p>
         </w:tc>
@@ -725,7 +725,7 @@
     </w:p>
     <w:p xmlns:w="http://schemas.openxmlformats.org/wordprocessingml/2006/main">
       <w:r>
-        <w:t xml:space="preserve">1. Aggiornare sbu_purchase_flow a 19.0.1.0.99 su Odoo.sh.</w:t>
+        <w:t xml:space="preserve">1. Aggiornare su Odoo.sh: sbu_purchase_flow 19.0.1.0.101, sbu_estimate 19.0.1.0.112.</w:t>
       </w:r>
     </w:p>
     <w:p xmlns:w="http://schemas.openxmlformats.org/wordprocessingml/2006/main">
@@ -755,7 +755,7 @@
     </w:p>
     <w:p xmlns:w="http://schemas.openxmlformats.org/wordprocessingml/2006/main">
       <w:r>
-        <w:t xml:space="preserve">Moduli: sbu_estimate, sbu_purchase_flow ≥ 19.0.1.0.99</w:t>
+        <w:t xml:space="preserve">Moduli: sbu_estimate ≥ 19.0.1.0.112, sbu_purchase_flow ≥ 19.0.1.0.101</w:t>
       </w:r>
     </w:p>
     <w:p xmlns:w="http://schemas.openxmlformats.org/wordprocessingml/2006/main">
@@ -1572,7 +1572,7 @@
     </w:p>
     <w:p xmlns:w="http://schemas.openxmlformats.org/wordprocessingml/2006/main">
       <w:r>
-        <w:t xml:space="preserve">Stato attuale: ⚠️ Migliorato, da validare insieme su file reale</w:t>
+        <w:t xml:space="preserve">Stato attuale: ⚠️ Migliorato — schema costi ANACO in schermata + UAT numerico</w:t>
       </w:r>
     </w:p>
     <w:p xmlns:w="http://schemas.openxmlformats.org/wordprocessingml/2006/main">
@@ -1592,6 +1592,26 @@
     </w:p>
     <w:p xmlns:w="http://schemas.openxmlformats.org/wordprocessingml/2006/main">
       <w:r>
+        <w:t xml:space="preserve">• Interfaccia costi ANACO (feedback maggio 2026): su riga preventivo e totali testata, sequenza come in Excel:</w:t>
+      </w:r>
+    </w:p>
+    <w:p xmlns:w="http://schemas.openxmlformats.org/wordprocessingml/2006/main">
+      <w:r>
+        <w:t xml:space="preserve">• Costo materiale lavorato e posato (CAD / TOT)</w:t>
+      </w:r>
+    </w:p>
+    <w:p xmlns:w="http://schemas.openxmlformats.org/wordprocessingml/2006/main">
+      <w:r>
+        <w:t xml:space="preserve">• A cui sommare: trasporto, PM, cantiere, extra (CAD / TOT)</w:t>
+      </w:r>
+    </w:p>
+    <w:p xmlns:w="http://schemas.openxmlformats.org/wordprocessingml/2006/main">
+      <w:r>
+        <w:t xml:space="preserve">• Subtotale → oneri industriali → MOL (indicatore) → prezzo cliente</w:t>
+      </w:r>
+    </w:p>
+    <w:p xmlns:w="http://schemas.openxmlformats.org/wordprocessingml/2006/main">
+      <w:r>
         <w:t xml:space="preserve">Cosa Le chiediamo di verificare con noi</w:t>
       </w:r>
     </w:p>
@@ -1612,22 +1632,27 @@
     </w:p>
     <w:p xmlns:w="http://schemas.openxmlformats.org/wordprocessingml/2006/main">
       <w:r>
-        <w:t xml:space="preserve">1. Import P1002 → controllare riga F1: BS ≈ 4443,06 €.</w:t>
-      </w:r>
-    </w:p>
-    <w:p xmlns:w="http://schemas.openxmlformats.org/wordprocessingml/2006/main">
-      <w:r>
-        <w:t xml:space="preserve">2. Tab Voci contrattuali SAL → Retention %.</w:t>
-      </w:r>
-    </w:p>
-    <w:p xmlns:w="http://schemas.openxmlformats.org/wordprocessingml/2006/main">
-      <w:r>
-        <w:t xml:space="preserve">3. Confrontare una riga Excel vs Odoo (prezzo TOT, costo TOT, margine %).</w:t>
-      </w:r>
-    </w:p>
-    <w:p xmlns:w="http://schemas.openxmlformats.org/wordprocessingml/2006/main">
-      <w:r>
-        <w:t xml:space="preserve">Modulo: sbu_estimate</w:t>
+        <w:t xml:space="preserve">1. Aggiornare sbu_estimate 19.0.1.0.112 → aprire riga preventivo → sezione PREVENTIVO IMPORTATO DA ANACO — schema costi.</w:t>
+      </w:r>
+    </w:p>
+    <w:p xmlns:w="http://schemas.openxmlformats.org/wordprocessingml/2006/main">
+      <w:r>
+        <w:t xml:space="preserve">2. Import P1002 → controllare riga F1: BS ≈ 4443,06 €; costi BB/BC.</w:t>
+      </w:r>
+    </w:p>
+    <w:p xmlns:w="http://schemas.openxmlformats.org/wordprocessingml/2006/main">
+      <w:r>
+        <w:t xml:space="preserve">3. Tab Voci contrattuali SAL → Retention %.</w:t>
+      </w:r>
+    </w:p>
+    <w:p xmlns:w="http://schemas.openxmlformats.org/wordprocessingml/2006/main">
+      <w:r>
+        <w:t xml:space="preserve">4. Confrontare una riga Excel vs Odoo (prezzo TOT, costo TOT, margine %).</w:t>
+      </w:r>
+    </w:p>
+    <w:p xmlns:w="http://schemas.openxmlformats.org/wordprocessingml/2006/main">
+      <w:r>
+        <w:t xml:space="preserve">Modulo: sbu_estimate ≥ 19.0.1.0.112</w:t>
       </w:r>
     </w:p>
     <w:p xmlns:w="http://schemas.openxmlformats.org/wordprocessingml/2006/main">
@@ -2302,12 +2327,12 @@
     </w:p>
     <w:p xmlns:w="http://schemas.openxmlformats.org/wordprocessingml/2006/main">
       <w:r>
-        <w:t xml:space="preserve">1. Aggiornare i moduli SBU su Odoo.sh dopo ogni rilascio (sbu_purchase_flow 19.0.1.0.99 per TMS Excel).</w:t>
-      </w:r>
-    </w:p>
-    <w:p xmlns:w="http://schemas.openxmlformats.org/wordprocessingml/2006/main">
-      <w:r>
-        <w:t xml:space="preserve">2. Verificare insieme i punti ⚠️ residui (8 Planner, 9 Logikal, 12 margini ANACO) su una commessa reale.</w:t>
+        <w:t xml:space="preserve">1. Aggiornare i moduli SBU su Odoo.sh dopo ogni rilascio (sbu_purchase_flow 19.0.1.0.101, sbu_estimate 19.0.1.0.112).</w:t>
+      </w:r>
+    </w:p>
+    <w:p xmlns:w="http://schemas.openxmlformats.org/wordprocessingml/2006/main">
+      <w:r>
+        <w:t xml:space="preserve">2. Verificare insieme i 3 punti parziali residui: 8 Planner, 9 Logikal, 12 margini ANACO (UI costi ok; parità numerica Excel da UAT).</w:t>
       </w:r>
     </w:p>
     <w:p xmlns:w="http://schemas.openxmlformats.org/wordprocessingml/2006/main">

</xml_diff>